<commit_message>
Refactor project structure and enhance security features
- Updated project stack to Java 21 and Spring Boot, replacing Spring MVC.
- Introduced Thymeleaf for server-side rendering and Spring Data JPA for database interactions.
- Added MySQL support with H2 in-memory for testing.
- Implemented Spring Security with BCrypt for password hashing and role-based access control.
- Created DatabaseUserDetailsService for user authentication and authorization.
- Updated application properties for flexible database configuration.
- Enhanced UI templates to display user information and roles dynamically.
- Added database schema (DDL) and seed data (seed.sql) for local development.
- Revised README.md to reflect changes in project scope and setup instructions.
</commit_message>
<xml_diff>
--- a/docs/HCMUTE-MVP-pham-vi-do-an-share.docx
+++ b/docs/HCMUTE-MVP-pham-vi-do-an-share.docx
@@ -54,13 +54,7 @@
     </w:p>
     <w:p>
       <w:r>
-        <w:rPr>
-          <w:b/>
-        </w:rPr>
-        <w:t>Ngày cập nhật:</w:t>
-      </w:r>
-      <w:r>
-        <w:t xml:space="preserve"> 23/08/2026</w:t>
+        <w:t>Ngày cập nhật: 26/08/2026</w:t>
       </w:r>
     </w:p>
     <w:p>
@@ -69,14 +63,7 @@
         <w:shd w:fill="F3F8FC"/>
       </w:pPr>
       <w:r>
-        <w:rPr>
-          <w:b/>
-          <w:color w:val="1F4D78"/>
-        </w:rPr>
-        <w:t xml:space="preserve">Kết luận nhanh: </w:t>
-      </w:r>
-      <w:r>
-        <w:t>Không cần xây như một sản phẩm production. Nhóm tập trung vào luồng cốt lõi: đăng nhập → đợt đăng ký → đề tài → nhóm → đăng ký đề tài → nộp báo cáo → đánh giá/điểm → công bố kết quả.</w:t>
+        <w:t>Kết luận nhanh: Không cần xây như một sản phẩm production. Nhóm tập trung vào luồng cốt lõi: đăng nhập và phân quyền → đợt đăng ký → đề tài → nhóm → đăng ký đề tài → nộp báo cáo → đánh giá/điểm → công bố kết quả. Role và permission được quản lý riêng để có thể thiết kế UI access control.</w:t>
       </w:r>
     </w:p>
     <w:p>
@@ -135,10 +122,7 @@
     </w:p>
     <w:p>
       <w:r>
-        <w:rPr>
-          <w:i w:val="0"/>
-        </w:rPr>
-        <w:t>Chỉ cần 8 thực thể khái niệm dưới đây cho luồng MVP. Bảng kỹ thuật trung gian có thể được tạo khi code nhưng không xem là nghiệp vụ độc lập.</w:t>
+        <w:t>Luồng nghiệp vụ MVP giữ 8 thực thể lõi. Phần authentication/authorization có thêm RoleEntity, PermissionEntity và hai entity trung gian UserRoleEntity, RolePermissionEntity để phục vụ giao diện quản lý role và permission; đây là nhóm thực thể kỹ thuật hỗ trợ, không mở rộng workflow đề tài.</w:t>
       </w:r>
     </w:p>
     <w:tbl>
@@ -316,14 +300,7 @@
             </w:tcBorders>
           </w:tcPr>
           <w:p>
-            <w:pPr>
-              <w:spacing w:after="40" w:line="240" w:lineRule="auto"/>
-            </w:pPr>
             <w:r>
-              <w:rPr>
-                <w:rFonts w:ascii="Calibri" w:hAnsi="Calibri"/>
-                <w:sz w:val="17"/>
-              </w:rPr>
               <w:t>1</w:t>
             </w:r>
           </w:p>
@@ -346,15 +323,8 @@
             </w:tcBorders>
           </w:tcPr>
           <w:p>
-            <w:pPr>
-              <w:spacing w:after="40" w:line="240" w:lineRule="auto"/>
-            </w:pPr>
             <w:r>
-              <w:rPr>
-                <w:rFonts w:ascii="Calibri" w:hAnsi="Calibri"/>
-                <w:sz w:val="17"/>
-              </w:rPr>
-              <w:t>User</w:t>
+              <w:t>UserEntity</w:t>
             </w:r>
           </w:p>
         </w:tc>
@@ -376,15 +346,8 @@
             </w:tcBorders>
           </w:tcPr>
           <w:p>
-            <w:pPr>
-              <w:spacing w:after="40" w:line="240" w:lineRule="auto"/>
-            </w:pPr>
             <w:r>
-              <w:rPr>
-                <w:rFonts w:ascii="Calibri" w:hAnsi="Calibri"/>
-                <w:sz w:val="17"/>
-              </w:rPr>
-              <w:t>Đăng nhập và phân quyền</w:t>
+              <w:t>Đăng nhập và tài khoản</w:t>
             </w:r>
           </w:p>
         </w:tc>
@@ -406,15 +369,8 @@
             </w:tcBorders>
           </w:tcPr>
           <w:p>
-            <w:pPr>
-              <w:spacing w:after="40" w:line="240" w:lineRule="auto"/>
-            </w:pPr>
             <w:r>
-              <w:rPr>
-                <w:rFonts w:ascii="Calibri" w:hAnsi="Calibri"/>
-                <w:sz w:val="17"/>
-              </w:rPr>
-              <w:t>username/email, password hash, role, status; role: Admin, Faculty Head, Lecturer, Student</w:t>
+              <w:t>login identifier, full name, email/mã số, password hash, active; nhận role qua UserRoleEntity</w:t>
             </w:r>
           </w:p>
         </w:tc>
@@ -441,14 +397,7 @@
             </w:tcBorders>
           </w:tcPr>
           <w:p>
-            <w:pPr>
-              <w:spacing w:after="40" w:line="240" w:lineRule="auto"/>
-            </w:pPr>
             <w:r>
-              <w:rPr>
-                <w:rFonts w:ascii="Calibri" w:hAnsi="Calibri"/>
-                <w:sz w:val="17"/>
-              </w:rPr>
               <w:t>2</w:t>
             </w:r>
           </w:p>
@@ -471,15 +420,8 @@
             </w:tcBorders>
           </w:tcPr>
           <w:p>
-            <w:pPr>
-              <w:spacing w:after="40" w:line="240" w:lineRule="auto"/>
-            </w:pPr>
             <w:r>
-              <w:rPr>
-                <w:rFonts w:ascii="Calibri" w:hAnsi="Calibri"/>
-                <w:sz w:val="17"/>
-              </w:rPr>
-              <w:t>Department</w:t>
+              <w:t>DepartmentEntity</w:t>
             </w:r>
           </w:p>
         </w:tc>
@@ -501,14 +443,7 @@
             </w:tcBorders>
           </w:tcPr>
           <w:p>
-            <w:pPr>
-              <w:spacing w:after="40" w:line="240" w:lineRule="auto"/>
-            </w:pPr>
             <w:r>
-              <w:rPr>
-                <w:rFonts w:ascii="Calibri" w:hAnsi="Calibri"/>
-                <w:sz w:val="17"/>
-              </w:rPr>
               <w:t>Phân loại khoa/bộ môn</w:t>
             </w:r>
           </w:p>
@@ -531,15 +466,8 @@
             </w:tcBorders>
           </w:tcPr>
           <w:p>
-            <w:pPr>
-              <w:spacing w:after="40" w:line="240" w:lineRule="auto"/>
-            </w:pPr>
             <w:r>
-              <w:rPr>
-                <w:rFonts w:ascii="Calibri" w:hAnsi="Calibri"/>
-                <w:sz w:val="17"/>
-              </w:rPr>
-              <w:t>code, name; dùng làm danh mục đơn giản</w:t>
+              <w:t>code, name, active</w:t>
             </w:r>
           </w:p>
         </w:tc>
@@ -566,14 +494,7 @@
             </w:tcBorders>
           </w:tcPr>
           <w:p>
-            <w:pPr>
-              <w:spacing w:after="40" w:line="240" w:lineRule="auto"/>
-            </w:pPr>
             <w:r>
-              <w:rPr>
-                <w:rFonts w:ascii="Calibri" w:hAnsi="Calibri"/>
-                <w:sz w:val="17"/>
-              </w:rPr>
               <w:t>3</w:t>
             </w:r>
           </w:p>
@@ -596,15 +517,8 @@
             </w:tcBorders>
           </w:tcPr>
           <w:p>
-            <w:pPr>
-              <w:spacing w:after="40" w:line="240" w:lineRule="auto"/>
-            </w:pPr>
             <w:r>
-              <w:rPr>
-                <w:rFonts w:ascii="Calibri" w:hAnsi="Calibri"/>
-                <w:sz w:val="17"/>
-              </w:rPr>
-              <w:t>RegistrationPeriod</w:t>
+              <w:t>RegistrationPeriodEntity</w:t>
             </w:r>
           </w:p>
         </w:tc>
@@ -626,14 +540,7 @@
             </w:tcBorders>
           </w:tcPr>
           <w:p>
-            <w:pPr>
-              <w:spacing w:after="40" w:line="240" w:lineRule="auto"/>
-            </w:pPr>
             <w:r>
-              <w:rPr>
-                <w:rFonts w:ascii="Calibri" w:hAnsi="Calibri"/>
-                <w:sz w:val="17"/>
-              </w:rPr>
               <w:t>Mở/đóng đợt đăng ký</w:t>
             </w:r>
           </w:p>
@@ -656,15 +563,8 @@
             </w:tcBorders>
           </w:tcPr>
           <w:p>
-            <w:pPr>
-              <w:spacing w:after="40" w:line="240" w:lineRule="auto"/>
-            </w:pPr>
             <w:r>
-              <w:rPr>
-                <w:rFonts w:ascii="Calibri" w:hAnsi="Calibri"/>
-                <w:sz w:val="17"/>
-              </w:rPr>
-              <w:t>name, type, start/end time cho GV và SV, status</w:t>
+              <w:t>name, type, thời gian GV/SV, deadline, status</w:t>
             </w:r>
           </w:p>
         </w:tc>
@@ -691,14 +591,7 @@
             </w:tcBorders>
           </w:tcPr>
           <w:p>
-            <w:pPr>
-              <w:spacing w:after="40" w:line="240" w:lineRule="auto"/>
-            </w:pPr>
             <w:r>
-              <w:rPr>
-                <w:rFonts w:ascii="Calibri" w:hAnsi="Calibri"/>
-                <w:sz w:val="17"/>
-              </w:rPr>
               <w:t>4</w:t>
             </w:r>
           </w:p>
@@ -721,15 +614,8 @@
             </w:tcBorders>
           </w:tcPr>
           <w:p>
-            <w:pPr>
-              <w:spacing w:after="40" w:line="240" w:lineRule="auto"/>
-            </w:pPr>
             <w:r>
-              <w:rPr>
-                <w:rFonts w:ascii="Calibri" w:hAnsi="Calibri"/>
-                <w:sz w:val="17"/>
-              </w:rPr>
-              <w:t>Topic</w:t>
+              <w:t>TopicEntity</w:t>
             </w:r>
           </w:p>
         </w:tc>
@@ -751,14 +637,7 @@
             </w:tcBorders>
           </w:tcPr>
           <w:p>
-            <w:pPr>
-              <w:spacing w:after="40" w:line="240" w:lineRule="auto"/>
-            </w:pPr>
             <w:r>
-              <w:rPr>
-                <w:rFonts w:ascii="Calibri" w:hAnsi="Calibri"/>
-                <w:sz w:val="17"/>
-              </w:rPr>
               <w:t>Đề tài được quản lý</w:t>
             </w:r>
           </w:p>
@@ -781,14 +660,7 @@
             </w:tcBorders>
           </w:tcPr>
           <w:p>
-            <w:pPr>
-              <w:spacing w:after="40" w:line="240" w:lineRule="auto"/>
-            </w:pPr>
             <w:r>
-              <w:rPr>
-                <w:rFonts w:ascii="Calibri" w:hAnsi="Calibri"/>
-                <w:sz w:val="17"/>
-              </w:rPr>
               <w:t>title, description, department, period, status, 1–2 supervisor</w:t>
             </w:r>
           </w:p>
@@ -816,14 +688,7 @@
             </w:tcBorders>
           </w:tcPr>
           <w:p>
-            <w:pPr>
-              <w:spacing w:after="40" w:line="240" w:lineRule="auto"/>
-            </w:pPr>
             <w:r>
-              <w:rPr>
-                <w:rFonts w:ascii="Calibri" w:hAnsi="Calibri"/>
-                <w:sz w:val="17"/>
-              </w:rPr>
               <w:t>5</w:t>
             </w:r>
           </w:p>
@@ -846,15 +711,8 @@
             </w:tcBorders>
           </w:tcPr>
           <w:p>
-            <w:pPr>
-              <w:spacing w:after="40" w:line="240" w:lineRule="auto"/>
-            </w:pPr>
             <w:r>
-              <w:rPr>
-                <w:rFonts w:ascii="Calibri" w:hAnsi="Calibri"/>
-                <w:sz w:val="17"/>
-              </w:rPr>
-              <w:t>StudentGroup</w:t>
+              <w:t>StudentGroupEntity</w:t>
             </w:r>
           </w:p>
         </w:tc>
@@ -876,14 +734,7 @@
             </w:tcBorders>
           </w:tcPr>
           <w:p>
-            <w:pPr>
-              <w:spacing w:after="40" w:line="240" w:lineRule="auto"/>
-            </w:pPr>
             <w:r>
-              <w:rPr>
-                <w:rFonts w:ascii="Calibri" w:hAnsi="Calibri"/>
-                <w:sz w:val="17"/>
-              </w:rPr>
               <w:t>Nhóm sinh viên</w:t>
             </w:r>
           </w:p>
@@ -906,14 +757,7 @@
             </w:tcBorders>
           </w:tcPr>
           <w:p>
-            <w:pPr>
-              <w:spacing w:after="40" w:line="240" w:lineRule="auto"/>
-            </w:pPr>
             <w:r>
-              <w:rPr>
-                <w:rFonts w:ascii="Calibri" w:hAnsi="Calibri"/>
-                <w:sz w:val="17"/>
-              </w:rPr>
               <w:t>name, leader, members; tối đa 3 thành viên</w:t>
             </w:r>
           </w:p>
@@ -941,14 +785,7 @@
             </w:tcBorders>
           </w:tcPr>
           <w:p>
-            <w:pPr>
-              <w:spacing w:after="40" w:line="240" w:lineRule="auto"/>
-            </w:pPr>
             <w:r>
-              <w:rPr>
-                <w:rFonts w:ascii="Calibri" w:hAnsi="Calibri"/>
-                <w:sz w:val="17"/>
-              </w:rPr>
               <w:t>6</w:t>
             </w:r>
           </w:p>
@@ -971,15 +808,8 @@
             </w:tcBorders>
           </w:tcPr>
           <w:p>
-            <w:pPr>
-              <w:spacing w:after="40" w:line="240" w:lineRule="auto"/>
-            </w:pPr>
             <w:r>
-              <w:rPr>
-                <w:rFonts w:ascii="Calibri" w:hAnsi="Calibri"/>
-                <w:sz w:val="17"/>
-              </w:rPr>
-              <w:t>TopicRegistration</w:t>
+              <w:t>TopicRegistrationEntity</w:t>
             </w:r>
           </w:p>
         </w:tc>
@@ -1001,14 +831,7 @@
             </w:tcBorders>
           </w:tcPr>
           <w:p>
-            <w:pPr>
-              <w:spacing w:after="40" w:line="240" w:lineRule="auto"/>
-            </w:pPr>
             <w:r>
-              <w:rPr>
-                <w:rFonts w:ascii="Calibri" w:hAnsi="Calibri"/>
-                <w:sz w:val="17"/>
-              </w:rPr>
               <w:t>Đơn đăng ký đề tài</w:t>
             </w:r>
           </w:p>
@@ -1031,15 +854,8 @@
             </w:tcBorders>
           </w:tcPr>
           <w:p>
-            <w:pPr>
-              <w:spacing w:after="40" w:line="240" w:lineRule="auto"/>
-            </w:pPr>
             <w:r>
-              <w:rPr>
-                <w:rFonts w:ascii="Calibri" w:hAnsi="Calibri"/>
-                <w:sz w:val="17"/>
-              </w:rPr>
-              <w:t>group, topic, created time, status; chỉ 1 đơn active/nhóm</w:t>
+              <w:t>group, topic, period, submittedBy, status; unique group + period</w:t>
             </w:r>
           </w:p>
         </w:tc>
@@ -1066,14 +882,7 @@
             </w:tcBorders>
           </w:tcPr>
           <w:p>
-            <w:pPr>
-              <w:spacing w:after="40" w:line="240" w:lineRule="auto"/>
-            </w:pPr>
             <w:r>
-              <w:rPr>
-                <w:rFonts w:ascii="Calibri" w:hAnsi="Calibri"/>
-                <w:sz w:val="17"/>
-              </w:rPr>
               <w:t>7</w:t>
             </w:r>
           </w:p>
@@ -1096,15 +905,8 @@
             </w:tcBorders>
           </w:tcPr>
           <w:p>
-            <w:pPr>
-              <w:spacing w:after="40" w:line="240" w:lineRule="auto"/>
-            </w:pPr>
             <w:r>
-              <w:rPr>
-                <w:rFonts w:ascii="Calibri" w:hAnsi="Calibri"/>
-                <w:sz w:val="17"/>
-              </w:rPr>
-              <w:t>Report</w:t>
+              <w:t>ReportEntity</w:t>
             </w:r>
           </w:p>
         </w:tc>
@@ -1126,14 +928,7 @@
             </w:tcBorders>
           </w:tcPr>
           <w:p>
-            <w:pPr>
-              <w:spacing w:after="40" w:line="240" w:lineRule="auto"/>
-            </w:pPr>
             <w:r>
-              <w:rPr>
-                <w:rFonts w:ascii="Calibri" w:hAnsi="Calibri"/>
-                <w:sz w:val="17"/>
-              </w:rPr>
               <w:t>Bài/bản báo cáo nộp</w:t>
             </w:r>
           </w:p>
@@ -1156,15 +951,8 @@
             </w:tcBorders>
           </w:tcPr>
           <w:p>
-            <w:pPr>
-              <w:spacing w:after="40" w:line="240" w:lineRule="auto"/>
-            </w:pPr>
             <w:r>
-              <w:rPr>
-                <w:rFonts w:ascii="Calibri" w:hAnsi="Calibri"/>
-                <w:sz w:val="17"/>
-              </w:rPr>
-              <w:t>registration, file metadata, uploader, uploaded time, status</w:t>
+              <w:t>registration, file metadata, uploader, submitted time</w:t>
             </w:r>
           </w:p>
         </w:tc>
@@ -1191,14 +979,7 @@
             </w:tcBorders>
           </w:tcPr>
           <w:p>
-            <w:pPr>
-              <w:spacing w:after="40" w:line="240" w:lineRule="auto"/>
-            </w:pPr>
             <w:r>
-              <w:rPr>
-                <w:rFonts w:ascii="Calibri" w:hAnsi="Calibri"/>
-                <w:sz w:val="17"/>
-              </w:rPr>
               <w:t>8</w:t>
             </w:r>
           </w:p>
@@ -1221,15 +1002,8 @@
             </w:tcBorders>
           </w:tcPr>
           <w:p>
-            <w:pPr>
-              <w:spacing w:after="40" w:line="240" w:lineRule="auto"/>
-            </w:pPr>
             <w:r>
-              <w:rPr>
-                <w:rFonts w:ascii="Calibri" w:hAnsi="Calibri"/>
-                <w:sz w:val="17"/>
-              </w:rPr>
-              <w:t>Evaluation</w:t>
+              <w:t>EvaluationEntity</w:t>
             </w:r>
           </w:p>
         </w:tc>
@@ -1251,14 +1025,7 @@
             </w:tcBorders>
           </w:tcPr>
           <w:p>
-            <w:pPr>
-              <w:spacing w:after="40" w:line="240" w:lineRule="auto"/>
-            </w:pPr>
             <w:r>
-              <w:rPr>
-                <w:rFonts w:ascii="Calibri" w:hAnsi="Calibri"/>
-                <w:sz w:val="17"/>
-              </w:rPr>
               <w:t>Chấm và công bố điểm</w:t>
             </w:r>
           </w:p>
@@ -1281,15 +1048,176 @@
             </w:tcBorders>
           </w:tcPr>
           <w:p>
-            <w:pPr>
-              <w:spacing w:after="40" w:line="240" w:lineRule="auto"/>
-            </w:pPr>
             <w:r>
-              <w:rPr>
-                <w:rFonts w:ascii="Calibri" w:hAnsi="Calibri"/>
-                <w:sz w:val="17"/>
-              </w:rPr>
-              <w:t>registration, assigned lecturer, score, comment, average, published status</w:t>
+              <w:t>registration, assigned lecturer, score, comment, average, status</w:t>
+            </w:r>
+          </w:p>
+        </w:tc>
+      </w:tr>
+      <w:tr>
+        <w:tc>
+          <w:tcPr>
+            <w:tcW w:type="dxa" w:w="504"/>
+          </w:tcPr>
+          <w:p>
+            <w:r>
+              <w:t>9</w:t>
+            </w:r>
+          </w:p>
+        </w:tc>
+        <w:tc>
+          <w:tcPr>
+            <w:tcW w:type="dxa" w:w="1800"/>
+          </w:tcPr>
+          <w:p>
+            <w:r>
+              <w:t>RoleEntity</w:t>
+            </w:r>
+          </w:p>
+        </w:tc>
+        <w:tc>
+          <w:tcPr>
+            <w:tcW w:type="dxa" w:w="2592"/>
+          </w:tcPr>
+          <w:p>
+            <w:r>
+              <w:t>Access bundle</w:t>
+            </w:r>
+          </w:p>
+        </w:tc>
+        <w:tc>
+          <w:tcPr>
+            <w:tcW w:type="dxa" w:w="4464"/>
+          </w:tcPr>
+          <w:p>
+            <w:r>
+              <w:t>code, name, description, systemRole, active</w:t>
+            </w:r>
+          </w:p>
+        </w:tc>
+      </w:tr>
+      <w:tr>
+        <w:tc>
+          <w:tcPr>
+            <w:tcW w:type="dxa" w:w="504"/>
+          </w:tcPr>
+          <w:p>
+            <w:r>
+              <w:t>10</w:t>
+            </w:r>
+          </w:p>
+        </w:tc>
+        <w:tc>
+          <w:tcPr>
+            <w:tcW w:type="dxa" w:w="1800"/>
+          </w:tcPr>
+          <w:p>
+            <w:r>
+              <w:t>PermissionEntity</w:t>
+            </w:r>
+          </w:p>
+        </w:tc>
+        <w:tc>
+          <w:tcPr>
+            <w:tcW w:type="dxa" w:w="2592"/>
+          </w:tcPr>
+          <w:p>
+            <w:r>
+              <w:t>Quyền thao tác</w:t>
+            </w:r>
+          </w:p>
+        </w:tc>
+        <w:tc>
+          <w:tcPr>
+            <w:tcW w:type="dxa" w:w="4464"/>
+          </w:tcPr>
+          <w:p>
+            <w:r>
+              <w:t>code, name, permissionGroup, description, active</w:t>
+            </w:r>
+          </w:p>
+        </w:tc>
+      </w:tr>
+      <w:tr>
+        <w:tc>
+          <w:tcPr>
+            <w:tcW w:type="dxa" w:w="504"/>
+          </w:tcPr>
+          <w:p>
+            <w:r>
+              <w:t>11</w:t>
+            </w:r>
+          </w:p>
+        </w:tc>
+        <w:tc>
+          <w:tcPr>
+            <w:tcW w:type="dxa" w:w="1800"/>
+          </w:tcPr>
+          <w:p>
+            <w:r>
+              <w:t>UserRoleEntity</w:t>
+            </w:r>
+          </w:p>
+        </w:tc>
+        <w:tc>
+          <w:tcPr>
+            <w:tcW w:type="dxa" w:w="2592"/>
+          </w:tcPr>
+          <w:p>
+            <w:r>
+              <w:t>Gán role cho user</w:t>
+            </w:r>
+          </w:p>
+        </w:tc>
+        <w:tc>
+          <w:tcPr>
+            <w:tcW w:type="dxa" w:w="4464"/>
+          </w:tcPr>
+          <w:p>
+            <w:r>
+              <w:t>user, role, assignedAt, active; unique user + role</w:t>
+            </w:r>
+          </w:p>
+        </w:tc>
+      </w:tr>
+      <w:tr>
+        <w:tc>
+          <w:tcPr>
+            <w:tcW w:type="dxa" w:w="504"/>
+          </w:tcPr>
+          <w:p>
+            <w:r>
+              <w:t>12</w:t>
+            </w:r>
+          </w:p>
+        </w:tc>
+        <w:tc>
+          <w:tcPr>
+            <w:tcW w:type="dxa" w:w="1800"/>
+          </w:tcPr>
+          <w:p>
+            <w:r>
+              <w:t>RolePermissionEntity</w:t>
+            </w:r>
+          </w:p>
+        </w:tc>
+        <w:tc>
+          <w:tcPr>
+            <w:tcW w:type="dxa" w:w="2592"/>
+          </w:tcPr>
+          <w:p>
+            <w:r>
+              <w:t>Gán permission cho role</w:t>
+            </w:r>
+          </w:p>
+        </w:tc>
+        <w:tc>
+          <w:tcPr>
+            <w:tcW w:type="dxa" w:w="4464"/>
+          </w:tcPr>
+          <w:p>
+            <w:r>
+              <w:t>role, permission, assignedAt, active; unique role + permission</w:t>
             </w:r>
           </w:p>
         </w:tc>
@@ -2473,6 +2401,90 @@
           </w:p>
         </w:tc>
       </w:tr>
+      <w:tr>
+        <w:tc>
+          <w:tcPr>
+            <w:tcW w:type="dxa" w:w="2232"/>
+          </w:tcPr>
+          <w:p>
+            <w:r>
+              <w:t>UserEntity</w:t>
+            </w:r>
+          </w:p>
+        </w:tc>
+        <w:tc>
+          <w:tcPr>
+            <w:tcW w:type="dxa" w:w="2232"/>
+          </w:tcPr>
+          <w:p>
+            <w:r>
+              <w:t>RoleEntity</w:t>
+            </w:r>
+          </w:p>
+        </w:tc>
+        <w:tc>
+          <w:tcPr>
+            <w:tcW w:type="dxa" w:w="1368"/>
+          </w:tcPr>
+          <w:p>
+            <w:r>
+              <w:t>N–N qua UserRoleEntity</w:t>
+            </w:r>
+          </w:p>
+        </w:tc>
+        <w:tc>
+          <w:tcPr>
+            <w:tcW w:type="dxa" w:w="3528"/>
+          </w:tcPr>
+          <w:p>
+            <w:r>
+              <w:t>Một user có thể có nhiều role; role có thể gán cho nhiều user.</w:t>
+            </w:r>
+          </w:p>
+        </w:tc>
+      </w:tr>
+      <w:tr>
+        <w:tc>
+          <w:tcPr>
+            <w:tcW w:type="dxa" w:w="2232"/>
+          </w:tcPr>
+          <w:p>
+            <w:r>
+              <w:t>RoleEntity</w:t>
+            </w:r>
+          </w:p>
+        </w:tc>
+        <w:tc>
+          <w:tcPr>
+            <w:tcW w:type="dxa" w:w="2232"/>
+          </w:tcPr>
+          <w:p>
+            <w:r>
+              <w:t>PermissionEntity</w:t>
+            </w:r>
+          </w:p>
+        </w:tc>
+        <w:tc>
+          <w:tcPr>
+            <w:tcW w:type="dxa" w:w="1368"/>
+          </w:tcPr>
+          <w:p>
+            <w:r>
+              <w:t>N–N qua RolePermissionEntity</w:t>
+            </w:r>
+          </w:p>
+        </w:tc>
+        <w:tc>
+          <w:tcPr>
+            <w:tcW w:type="dxa" w:w="3528"/>
+          </w:tcPr>
+          <w:p>
+            <w:r>
+              <w:t>Permission dùng lại cho nhiều role; UI có thể bật/tắt từng quyền.</w:t>
+            </w:r>
+          </w:p>
+        </w:tc>
+      </w:tr>
     </w:tbl>
     <w:p>
       <w:pPr>
@@ -2481,10 +2493,7 @@
     </w:p>
     <w:p>
       <w:r>
-        <w:rPr>
-          <w:i w:val="0"/>
-        </w:rPr>
-        <w:t>ReviewBoard, BoardMember, nhiều reviewer, chair/secretary và các quan hệ tổng hợp điểm là mô hình mở rộng. Chỉ thêm khi nhóm đã hoàn thành luồng Must Have hoặc giảng viên yêu cầu trực tiếp.</w:t>
+        <w:t>UserEntity nhận role qua UserRoleEntity; RoleEntity nhận permission qua RolePermissionEntity. ReviewBoard, BoardMember, nhiều reviewer, chair/secretary và các quan hệ tổng hợp điểm là mô hình mở rộng. Chỉ thêm khi nhóm đã hoàn thành luồng Must Have hoặc giảng viên yêu cầu trực tiếp.</w:t>
       </w:r>
     </w:p>
     <w:p>
@@ -2646,14 +2655,7 @@
             </w:tcBorders>
           </w:tcPr>
           <w:p>
-            <w:pPr>
-              <w:spacing w:after="40" w:line="240" w:lineRule="auto"/>
-            </w:pPr>
             <w:r>
-              <w:rPr>
-                <w:rFonts w:ascii="Calibri" w:hAnsi="Calibri"/>
-                <w:sz w:val="17"/>
-              </w:rPr>
               <w:t>FR-01</w:t>
             </w:r>
           </w:p>
@@ -2676,15 +2678,8 @@
             </w:tcBorders>
           </w:tcPr>
           <w:p>
-            <w:pPr>
-              <w:spacing w:after="40" w:line="240" w:lineRule="auto"/>
-            </w:pPr>
             <w:r>
-              <w:rPr>
-                <w:rFonts w:ascii="Calibri" w:hAnsi="Calibri"/>
-                <w:sz w:val="17"/>
-              </w:rPr>
-              <w:t>Đăng nhập, session và role</w:t>
+              <w:t>Đăng nhập, session và RBAC</w:t>
             </w:r>
           </w:p>
         </w:tc>
@@ -2706,15 +2701,8 @@
             </w:tcBorders>
           </w:tcPr>
           <w:p>
-            <w:pPr>
-              <w:spacing w:after="40" w:line="240" w:lineRule="auto"/>
-            </w:pPr>
             <w:r>
-              <w:rPr>
-                <w:rFonts w:ascii="Calibri" w:hAnsi="Calibri"/>
-                <w:sz w:val="17"/>
-              </w:rPr>
-              <w:t>Đăng nhập được; mật khẩu lưu dạng hash; route bị chặn theo role.</w:t>
+              <w:t>Đăng nhập được; password lưu hash; route/action được kiểm tra theo role và permission.</w:t>
             </w:r>
           </w:p>
         </w:tc>
@@ -2741,14 +2729,7 @@
             </w:tcBorders>
           </w:tcPr>
           <w:p>
-            <w:pPr>
-              <w:spacing w:after="40" w:line="240" w:lineRule="auto"/>
-            </w:pPr>
             <w:r>
-              <w:rPr>
-                <w:rFonts w:ascii="Calibri" w:hAnsi="Calibri"/>
-                <w:sz w:val="17"/>
-              </w:rPr>
               <w:t>FR-02</w:t>
             </w:r>
           </w:p>
@@ -2771,15 +2752,8 @@
             </w:tcBorders>
           </w:tcPr>
           <w:p>
-            <w:pPr>
-              <w:spacing w:after="40" w:line="240" w:lineRule="auto"/>
-            </w:pPr>
             <w:r>
-              <w:rPr>
-                <w:rFonts w:ascii="Calibri" w:hAnsi="Calibri"/>
-                <w:sz w:val="17"/>
-              </w:rPr>
-              <w:t>Tài khoản cơ bản</w:t>
+              <w:t>Tài khoản, role và permission</w:t>
             </w:r>
           </w:p>
         </w:tc>
@@ -2801,15 +2775,8 @@
             </w:tcBorders>
           </w:tcPr>
           <w:p>
-            <w:pPr>
-              <w:spacing w:after="40" w:line="240" w:lineRule="auto"/>
-            </w:pPr>
             <w:r>
-              <w:rPr>
-                <w:rFonts w:ascii="Calibri" w:hAnsi="Calibri"/>
-                <w:sz w:val="17"/>
-              </w:rPr>
-              <w:t>Admin tạo/sửa/khóa tài khoản và gán role cần thiết.</w:t>
+              <w:t>Admin tạo/sửa/khóa tài khoản, gán role; quản lý role và bật/tắt permission trên role.</w:t>
             </w:r>
           </w:p>
         </w:tc>
@@ -3772,6 +3739,30 @@
     </w:p>
     <w:p>
       <w:pPr>
+        <w:pStyle w:val="ListBullet"/>
+      </w:pPr>
+      <w:r>
+        <w:t>Đăng nhập/đăng xuất, session và phân quyền theo role + permission.</w:t>
+      </w:r>
+    </w:p>
+    <w:p>
+      <w:pPr>
+        <w:pStyle w:val="ListBullet"/>
+      </w:pPr>
+      <w:r>
+        <w:t>Admin quản lý tài khoản; quản lý role và bật/tắt permission trên role.</w:t>
+      </w:r>
+    </w:p>
+    <w:p>
+      <w:pPr>
+        <w:pStyle w:val="ListBullet"/>
+      </w:pPr>
+      <w:r>
+        <w:t>Luồng demo chính: đợt đăng ký → đề tài → nhóm → đăng ký → báo cáo → đánh giá → công bố kết quả.</w:t>
+      </w:r>
+    </w:p>
+    <w:p>
+      <w:pPr>
         <w:pStyle w:val="Heading2"/>
         <w:keepNext/>
       </w:pPr>
@@ -4177,14 +4168,7 @@
             </w:tcBorders>
           </w:tcPr>
           <w:p>
-            <w:pPr>
-              <w:spacing w:after="40" w:line="240" w:lineRule="auto"/>
-            </w:pPr>
             <w:r>
-              <w:rPr>
-                <w:rFonts w:ascii="Calibri" w:hAnsi="Calibri"/>
-                <w:sz w:val="17"/>
-              </w:rPr>
               <w:t>2</w:t>
             </w:r>
           </w:p>
@@ -4207,14 +4191,7 @@
             </w:tcBorders>
           </w:tcPr>
           <w:p>
-            <w:pPr>
-              <w:spacing w:after="40" w:line="240" w:lineRule="auto"/>
-            </w:pPr>
             <w:r>
-              <w:rPr>
-                <w:rFonts w:ascii="Calibri" w:hAnsi="Calibri"/>
-                <w:sz w:val="17"/>
-              </w:rPr>
               <w:t>Đăng nhập/quyền</w:t>
             </w:r>
           </w:p>
@@ -4237,15 +4214,8 @@
             </w:tcBorders>
           </w:tcPr>
           <w:p>
-            <w:pPr>
-              <w:spacing w:after="40" w:line="240" w:lineRule="auto"/>
-            </w:pPr>
             <w:r>
-              <w:rPr>
-                <w:rFonts w:ascii="Calibri" w:hAnsi="Calibri"/>
-                <w:sz w:val="17"/>
-              </w:rPr>
-              <w:t>Mỗi role vào đúng màn hình; route trái quyền bị chặn.</w:t>
+              <w:t>Mỗi user được gán đúng role; permission của role quyết định action/route; truy cập trái quyền bị chặn.</w:t>
             </w:r>
           </w:p>
         </w:tc>
@@ -5022,6 +4992,22 @@
     <w:p>
       <w:pPr>
         <w:pStyle w:val="ListBullet"/>
+      </w:pPr>
+      <w:r>
+        <w:t>database/ddl.sql — script MySQL tạo database, bảng MVP, bảng RBAC và khóa ngoại.</w:t>
+      </w:r>
+    </w:p>
+    <w:p>
+      <w:pPr>
+        <w:pStyle w:val="ListBullet"/>
+      </w:pPr>
+      <w:r>
+        <w:t>database/seed.sql — seed role ADMIN, permission quản trị và account local để bắt đầu code.</w:t>
+      </w:r>
+    </w:p>
+    <w:p>
+      <w:pPr>
+        <w:pStyle w:val="ListBullet"/>
         <w:ind w:left="360" w:hanging="173"/>
       </w:pPr>
       <w:r>
@@ -5029,12 +5015,64 @@
       </w:r>
     </w:p>
     <w:p>
+      <w:pPr>
+        <w:pStyle w:val="Heading1"/>
+      </w:pPr>
       <w:r>
-        <w:rPr>
-          <w:i/>
-          <w:color w:val="666666"/>
-        </w:rPr>
-        <w:t>Tài liệu này là bản tóm tắt để thống nhất với nhóm. Khi có thay đổi, cập nhật REQUEST.md và quyết định phạm vi trước, sau đó mới đồng bộ code/tài liệu.</w:t>
+        <w:t>9. Thiết lập seed dữ liệu local</w:t>
+      </w:r>
+    </w:p>
+    <w:p>
+      <w:pPr>
+        <w:pStyle w:val="ListBullet"/>
+      </w:pPr>
+      <w:r>
+        <w:t>Chạy database/ddl.sql trước để tạo database và 14 bảng, sau đó chạy database/seed.sql để tạo dữ liệu khởi đầu.</w:t>
+      </w:r>
+    </w:p>
+    <w:p>
+      <w:pPr>
+        <w:pStyle w:val="ListBullet"/>
+      </w:pPr>
+      <w:r>
+        <w:t>Seed tạo role ADMIN và 10 permission quản trị theo nhóm Dashboard, Users và Roles; quan hệ được lưu qua UserRoleEntity và RolePermissionEntity.</w:t>
+      </w:r>
+    </w:p>
+    <w:p>
+      <w:pPr>
+        <w:pStyle w:val="ListBullet"/>
+      </w:pPr>
+      <w:r>
+        <w:t>Account local: username admin, password Admin@12345. Đây là credential dùng cho môi trường local; phải đổi trước khi chia sẻ hoặc deploy.</w:t>
+      </w:r>
+    </w:p>
+    <w:p>
+      <w:pPr>
+        <w:pStyle w:val="ListBullet"/>
+      </w:pPr>
+      <w:r>
+        <w:t>Password trong database/seed.sql chỉ lưu BCrypt hash, không lưu plaintext.</w:t>
+      </w:r>
+    </w:p>
+    <w:p>
+      <w:pPr>
+        <w:pStyle w:val="ListBullet"/>
+      </w:pPr>
+      <w:r>
+        <w:t>Lệnh chạy: mysql -u root -p &lt; database/ddl.sql, sau đó mysql -u root -p &lt; database/seed.sql.</w:t>
+      </w:r>
+    </w:p>
+    <w:p>
+      <w:pPr>
+        <w:pStyle w:val="ListBullet"/>
+      </w:pPr>
+      <w:r>
+        <w:t>Sau bước seed, cần nối UserDetailsService với UserRepository để Spring Security đăng nhập bằng account trong database.</w:t>
+      </w:r>
+    </w:p>
+    <w:p>
+      <w:r>
+        <w:t>Tài liệu này là bản tóm tắt để thống nhất với nhóm. Khi có thay đổi, cập nhật REQUEST.md và quyết định phạm vi trước, sau đó mới đồng bộ entity, repository, database/ddl.sql, database/seed.sql và giao diện.</w:t>
       </w:r>
     </w:p>
     <w:sectPr>

</xml_diff>